<commit_message>
Update PaperworkPilot v3 documentation and runtime
</commit_message>
<xml_diff>
--- a/PaperworkPilot_Week3_Project_Documentation.docx
+++ b/PaperworkPilot_Week3_Project_Documentation.docx
@@ -4,6 +4,7 @@
   <w:body>
     <w:p>
       <w:pPr>
+        <w:pStyle w:val="Title"/>
         <w:spacing w:before="0" w:after="60"/>
       </w:pPr>
       <w:r>
@@ -38,7 +39,7 @@
           <w:color w:val="000000"/>
           <w:sz w:val="22"/>
         </w:rPr>
-        <w:t>Prepared by: [Your Name]</w:t>
+        <w:t>Prepared by Kanu</w:t>
       </w:r>
     </w:p>
     <w:p>
@@ -49,18 +50,7 @@
           <w:color w:val="000000"/>
           <w:sz w:val="22"/>
         </w:rPr>
-        <w:t>Submission deadline: Sunday, August 30, 2026</w:t>
-      </w:r>
-    </w:p>
-    <w:p>
-      <w:r>
-        <w:rPr>
-          <w:rFonts w:ascii="Arial" w:hAnsi="Arial"/>
-          <w:b w:val="0"/>
-          <w:color w:val="000000"/>
-          <w:sz w:val="22"/>
-        </w:rPr>
-        <w:t>Project links: GitHub [ADD URL] | Replit [ADD URL] | Demo video [ADD URL]</w:t>
+        <w:t>Live application: https://paperwork-pilot-ai.replit.app</w:t>
       </w:r>
     </w:p>
     <w:p>
@@ -91,7 +81,7 @@
           <w:color w:val="000000"/>
           <w:sz w:val="22"/>
         </w:rPr>
-        <w:t>This is an agentic system rather than a one-shot language-model call. A stateful LangGraph workflow performs safety intake, structured extraction, evidence verification, profile matching, uncertainty review, a mandatory human checkpoint, and final plan assembly. It retries transient failures, preserves state across approval, and stops safely when the reviewer rejects the plan.</w:t>
+        <w:t>This is an agentic system rather than a one-shot language-model call. A stateful LangGraph workflow performs safety intake, dependency routing, structured or fallback extraction, evidence verification, profile matching, uncertainty review, resumable human checkpoints, and final plan assembly. It retries transient failures and preserves state across approval and revision.</w:t>
       </w:r>
     </w:p>
     <w:p>
@@ -261,6 +251,20 @@
           <w:color w:val="000000"/>
           <w:sz w:val="22"/>
         </w:rPr>
+        <w:t>Dependency check records extractor availability and selects the primary or conservative local path.</w:t>
+      </w:r>
+    </w:p>
+    <w:p>
+      <w:pPr>
+        <w:pStyle w:val="ListNumber"/>
+      </w:pPr>
+      <w:r>
+        <w:rPr>
+          <w:rFonts w:ascii="Arial" w:hAnsi="Arial"/>
+          <w:b w:val="0"/>
+          <w:color w:val="000000"/>
+          <w:sz w:val="22"/>
+        </w:rPr>
         <w:t>Requirement extraction produces a strict structured representation of fields, documents, warnings, choices, and deadlines.</w:t>
       </w:r>
     </w:p>
@@ -331,7 +335,7 @@
           <w:color w:val="000000"/>
           <w:sz w:val="22"/>
         </w:rPr>
-        <w:t>Approval or edit resumes the same run; rejection routes to a safe stop.</w:t>
+        <w:t>Approval or edit resumes the same run; a change request creates a second checkpoint; stop ends without a final plan.</w:t>
       </w:r>
     </w:p>
     <w:p>
@@ -1197,7 +1201,7 @@
           <w:color w:val="000000"/>
           <w:sz w:val="22"/>
         </w:rPr>
-        <w:t>Allow the reviewer to approve, add an edit note, or reject and stop safely.</w:t>
+        <w:t>Allow the reviewer to approve, edit, request changes and resume, or stop safely.</w:t>
       </w:r>
     </w:p>
     <w:p>
@@ -1392,6 +1396,76 @@
                 <w:color w:val="000000"/>
                 <w:sz w:val="20"/>
               </w:rPr>
+              <w:t>Extraction dependency unavailable</w:t>
+            </w:r>
+          </w:p>
+        </w:tc>
+        <w:tc>
+          <w:tcPr>
+            <w:tcW w:type="dxa" w:w="6560"/>
+            <w:tcBorders>
+              <w:top w:val="single" w:sz="4" w:space="0" w:color="DADCE0"/>
+              <w:start w:val="single" w:sz="4" w:space="0" w:color="DADCE0"/>
+              <w:bottom w:val="single" w:sz="4" w:space="0" w:color="DADCE0"/>
+              <w:end w:val="single" w:sz="4" w:space="0" w:color="DADCE0"/>
+              <w:insideH w:val="single" w:sz="4" w:space="0" w:color="DADCE0"/>
+              <w:insideV w:val="single" w:sz="4" w:space="0" w:color="DADCE0"/>
+            </w:tcBorders>
+            <w:tcMar>
+              <w:top w:w="80" w:type="dxa"/>
+              <w:start w:w="120" w:type="dxa"/>
+              <w:bottom w:w="80" w:type="dxa"/>
+              <w:end w:w="120" w:type="dxa"/>
+            </w:tcMar>
+            <w:vAlign w:val="center"/>
+          </w:tcPr>
+          <w:p>
+            <w:pPr>
+              <w:spacing w:after="0"/>
+            </w:pPr>
+            <w:r>
+              <w:rPr>
+                <w:rFonts w:ascii="Arial" w:hAnsi="Arial"/>
+                <w:b w:val="0"/>
+                <w:color w:val="000000"/>
+                <w:sz w:val="20"/>
+              </w:rPr>
+              <w:t>Route to the conservative local extractor and record recovery.</w:t>
+            </w:r>
+          </w:p>
+        </w:tc>
+      </w:tr>
+      <w:tr>
+        <w:tc>
+          <w:tcPr>
+            <w:tcW w:type="dxa" w:w="2800"/>
+            <w:tcBorders>
+              <w:top w:val="single" w:sz="4" w:space="0" w:color="DADCE0"/>
+              <w:start w:val="single" w:sz="4" w:space="0" w:color="DADCE0"/>
+              <w:bottom w:val="single" w:sz="4" w:space="0" w:color="DADCE0"/>
+              <w:end w:val="single" w:sz="4" w:space="0" w:color="DADCE0"/>
+              <w:insideH w:val="single" w:sz="4" w:space="0" w:color="DADCE0"/>
+              <w:insideV w:val="single" w:sz="4" w:space="0" w:color="DADCE0"/>
+            </w:tcBorders>
+            <w:tcMar>
+              <w:top w:w="80" w:type="dxa"/>
+              <w:start w:w="120" w:type="dxa"/>
+              <w:bottom w:w="80" w:type="dxa"/>
+              <w:end w:w="120" w:type="dxa"/>
+            </w:tcMar>
+            <w:vAlign w:val="center"/>
+          </w:tcPr>
+          <w:p>
+            <w:pPr>
+              <w:spacing w:after="0"/>
+            </w:pPr>
+            <w:r>
+              <w:rPr>
+                <w:rFonts w:ascii="Arial" w:hAnsi="Arial"/>
+                <w:b w:val="0"/>
+                <w:color w:val="000000"/>
+                <w:sz w:val="20"/>
+              </w:rPr>
               <w:t>Model or schema failure</w:t>
             </w:r>
           </w:p>
@@ -1496,7 +1570,7 @@
                 <w:color w:val="000000"/>
                 <w:sz w:val="20"/>
               </w:rPr>
-              <w:t>Return actionable setup guidance; keep the deterministic demo available.</w:t>
+              <w:t>Use local extraction for pasted text; explain that image and scanned-PDF intake needs the key.</w:t>
             </w:r>
           </w:p>
         </w:tc>
@@ -1602,7 +1676,77 @@
                 <w:color w:val="000000"/>
                 <w:sz w:val="20"/>
               </w:rPr>
-              <w:t>Human rejection</w:t>
+              <w:t>Human change request</w:t>
+            </w:r>
+          </w:p>
+        </w:tc>
+        <w:tc>
+          <w:tcPr>
+            <w:tcW w:type="dxa" w:w="6560"/>
+            <w:tcBorders>
+              <w:top w:val="single" w:sz="4" w:space="0" w:color="DADCE0"/>
+              <w:start w:val="single" w:sz="4" w:space="0" w:color="DADCE0"/>
+              <w:bottom w:val="single" w:sz="4" w:space="0" w:color="DADCE0"/>
+              <w:end w:val="single" w:sz="4" w:space="0" w:color="DADCE0"/>
+              <w:insideH w:val="single" w:sz="4" w:space="0" w:color="DADCE0"/>
+              <w:insideV w:val="single" w:sz="4" w:space="0" w:color="DADCE0"/>
+            </w:tcBorders>
+            <w:tcMar>
+              <w:top w:w="80" w:type="dxa"/>
+              <w:start w:w="120" w:type="dxa"/>
+              <w:bottom w:w="80" w:type="dxa"/>
+              <w:end w:w="120" w:type="dxa"/>
+            </w:tcMar>
+            <w:vAlign w:val="center"/>
+          </w:tcPr>
+          <w:p>
+            <w:pPr>
+              <w:spacing w:after="0"/>
+            </w:pPr>
+            <w:r>
+              <w:rPr>
+                <w:rFonts w:ascii="Arial" w:hAnsi="Arial"/>
+                <w:b w:val="0"/>
+                <w:color w:val="000000"/>
+                <w:sz w:val="20"/>
+              </w:rPr>
+              <w:t>Preserve state, pause again, and resume the same run after an edited instruction.</w:t>
+            </w:r>
+          </w:p>
+        </w:tc>
+      </w:tr>
+      <w:tr>
+        <w:tc>
+          <w:tcPr>
+            <w:tcW w:type="dxa" w:w="2800"/>
+            <w:tcBorders>
+              <w:top w:val="single" w:sz="4" w:space="0" w:color="DADCE0"/>
+              <w:start w:val="single" w:sz="4" w:space="0" w:color="DADCE0"/>
+              <w:bottom w:val="single" w:sz="4" w:space="0" w:color="DADCE0"/>
+              <w:end w:val="single" w:sz="4" w:space="0" w:color="DADCE0"/>
+              <w:insideH w:val="single" w:sz="4" w:space="0" w:color="DADCE0"/>
+              <w:insideV w:val="single" w:sz="4" w:space="0" w:color="DADCE0"/>
+            </w:tcBorders>
+            <w:tcMar>
+              <w:top w:w="80" w:type="dxa"/>
+              <w:start w:w="120" w:type="dxa"/>
+              <w:bottom w:w="80" w:type="dxa"/>
+              <w:end w:w="120" w:type="dxa"/>
+            </w:tcMar>
+            <w:vAlign w:val="center"/>
+          </w:tcPr>
+          <w:p>
+            <w:pPr>
+              <w:spacing w:after="0"/>
+            </w:pPr>
+            <w:r>
+              <w:rPr>
+                <w:rFonts w:ascii="Arial" w:hAnsi="Arial"/>
+                <w:b w:val="0"/>
+                <w:color w:val="000000"/>
+                <w:sz w:val="20"/>
+              </w:rPr>
+              <w:t>Human stop</w:t>
             </w:r>
           </w:p>
         </w:tc>
@@ -1664,7 +1808,7 @@
           <w:color w:val="000000"/>
           <w:sz w:val="22"/>
         </w:rPr>
-        <w:t>Browser FormData -&gt; FastAPI validation -&gt; LangGraph thread -&gt; safety -&gt; extraction -&gt; evidence verification with retry -&gt; profile matching -&gt; uncertainty review -&gt; interrupt/checkpoint -&gt; human decision -&gt; plan assembly or safe stop -&gt; browser run receipt.</w:t>
+        <w:t>Browser FormData -&gt; FastAPI validation -&gt; LangGraph thread -&gt; safety -&gt; dependency check -&gt; extraction or local fallback -&gt; evidence verification with retry -&gt; profile matching -&gt; uncertainty review -&gt; interrupt/checkpoint -&gt; approval, revision checkpoint, or safe stop -&gt; browser run receipt.</w:t>
       </w:r>
     </w:p>
     <w:p>
@@ -1754,7 +1898,7 @@
           <w:color w:val="000000"/>
           <w:sz w:val="22"/>
         </w:rPr>
-        <w:t>POST /api/runs/{run_id}/resume - approve, edit, or reject</w:t>
+        <w:t>POST /api/runs/{run_id}/resume - approve, edit, request changes, or stop</w:t>
       </w:r>
     </w:p>
     <w:p>
@@ -1799,16 +1943,7 @@
           <w:color w:val="000000"/>
           <w:sz w:val="22"/>
         </w:rPr>
-        <w:t>The evaluation dataset contains 12 original synthetic form fragments. Cases cover ordinary forms, attachments, signatures, prompt injection, developer/system-message impersonation, Social Security information, passport information, bank information, and legitimate non-sensitive inputs. Synthetic data avoids redistributing private or copyrighted forms and makes expected routing deterministic.</w:t>
-      </w:r>
-    </w:p>
-    <w:p>
-      <w:pPr>
-        <w:pStyle w:val="Heading1"/>
-        <w:keepNext/>
-      </w:pPr>
-      <w:r>
-        <w:t>5. AI-assisted development prompts</w:t>
+        <w:t>Four additional deterministic modes cover a school consent form, utility hardship application, extraction-dependency outage, and reject/revise/resume behavior. All five demos run without an API key.</w:t>
       </w:r>
     </w:p>
     <w:p>
@@ -1819,7 +1954,27 @@
           <w:color w:val="000000"/>
           <w:sz w:val="22"/>
         </w:rPr>
-        <w:t>The academy requires representative development prompts. AI coding assistance accelerated scaffolding, test design, and documentation review; architecture choices and acceptance decisions were verified against the running system and executable tests.</w:t>
+        <w:t>The evaluation dataset contains 12 original synthetic form fragments. Cases cover ordinary forms, attachments, signatures, prompt injection, developer/system-message impersonation, Social Security information, passport information, bank information, and legitimate non-sensitive inputs. Synthetic data avoids redistributing private or copyrighted forms and makes expected routing deterministic.</w:t>
+      </w:r>
+    </w:p>
+    <w:p>
+      <w:pPr>
+        <w:pStyle w:val="Heading1"/>
+        <w:keepNext/>
+      </w:pPr>
+      <w:r>
+        <w:t>5. Development prompts</w:t>
+      </w:r>
+    </w:p>
+    <w:p>
+      <w:r>
+        <w:rPr>
+          <w:rFonts w:ascii="Arial" w:hAnsi="Arial"/>
+          <w:b w:val="0"/>
+          <w:color w:val="000000"/>
+          <w:sz w:val="22"/>
+        </w:rPr>
+        <w:t>Representative prompts used to define the product and its acceptance criteria are included because the project brief requests them.</w:t>
       </w:r>
     </w:p>
     <w:p>
@@ -1928,7 +2083,7 @@
           <w:color w:val="000000"/>
           <w:sz w:val="22"/>
         </w:rPr>
-        <w:t>Test prompt injection, sensitive fields, ambiguous deadlines, rejection, missing profile values, API contracts, and frontend accessibility landmarks.</w:t>
+        <w:t>Test prompt injection, sensitive fields, ambiguous deadlines, dependency failure, reject and resume, missing profile values, API contracts, and frontend accessibility landmarks.</w:t>
       </w:r>
     </w:p>
     <w:p>
@@ -1998,6 +2153,26 @@
           <w:sz w:val="22"/>
         </w:rPr>
         <w:t>Exact evidence verification, prompt-injection isolation, retry policy, conservative fallback, agent trace, unit and API tests, frontend contract tests, and adversarial fixtures were added. Obsolete implementation paths were removed so the documented architecture can be followed directly in code.</w:t>
+      </w:r>
+    </w:p>
+    <w:p>
+      <w:pPr>
+        <w:pStyle w:val="Heading2"/>
+        <w:keepNext/>
+      </w:pPr>
+      <w:r>
+        <w:t>Iteration 4: Observable resilience and revision</w:t>
+      </w:r>
+    </w:p>
+    <w:p>
+      <w:r>
+        <w:rPr>
+          <w:rFonts w:ascii="Arial" w:hAnsi="Arial"/>
+          <w:b w:val="0"/>
+          <w:color w:val="000000"/>
+          <w:sz w:val="22"/>
+        </w:rPr>
+        <w:t>Dependency health became an explicit graph node, a reproducible outage demo was added, rejection became a state-preserving revision checkpoint, and cost and latency metadata became visible in the final run receipt.</w:t>
       </w:r>
     </w:p>
     <w:p>
@@ -2167,7 +2342,7 @@
                 <w:color w:val="000000"/>
                 <w:sz w:val="20"/>
               </w:rPr>
-              <w:t>18 passed; 0 failed</w:t>
+              <w:t>22 passed; 0 failed</w:t>
             </w:r>
           </w:p>
         </w:tc>
@@ -2553,6 +2728,146 @@
                 <w:color w:val="000000"/>
                 <w:sz w:val="20"/>
               </w:rPr>
+              <w:t>Dependency outage</w:t>
+            </w:r>
+          </w:p>
+        </w:tc>
+        <w:tc>
+          <w:tcPr>
+            <w:tcW w:type="dxa" w:w="4960"/>
+            <w:tcBorders>
+              <w:top w:val="single" w:sz="4" w:space="0" w:color="DADCE0"/>
+              <w:start w:val="single" w:sz="4" w:space="0" w:color="DADCE0"/>
+              <w:bottom w:val="single" w:sz="4" w:space="0" w:color="DADCE0"/>
+              <w:end w:val="single" w:sz="4" w:space="0" w:color="DADCE0"/>
+              <w:insideH w:val="single" w:sz="4" w:space="0" w:color="DADCE0"/>
+              <w:insideV w:val="single" w:sz="4" w:space="0" w:color="DADCE0"/>
+            </w:tcBorders>
+            <w:tcMar>
+              <w:top w:w="80" w:type="dxa"/>
+              <w:start w:w="120" w:type="dxa"/>
+              <w:bottom w:w="80" w:type="dxa"/>
+              <w:end w:w="120" w:type="dxa"/>
+            </w:tcMar>
+            <w:vAlign w:val="center"/>
+          </w:tcPr>
+          <w:p>
+            <w:pPr>
+              <w:spacing w:after="0"/>
+            </w:pPr>
+            <w:r>
+              <w:rPr>
+                <w:rFonts w:ascii="Arial" w:hAnsi="Arial"/>
+                <w:b w:val="0"/>
+                <w:color w:val="000000"/>
+                <w:sz w:val="20"/>
+              </w:rPr>
+              <w:t>Recovered with 0 model calls</w:t>
+            </w:r>
+          </w:p>
+        </w:tc>
+      </w:tr>
+      <w:tr>
+        <w:tc>
+          <w:tcPr>
+            <w:tcW w:type="dxa" w:w="4400"/>
+            <w:tcBorders>
+              <w:top w:val="single" w:sz="4" w:space="0" w:color="DADCE0"/>
+              <w:start w:val="single" w:sz="4" w:space="0" w:color="DADCE0"/>
+              <w:bottom w:val="single" w:sz="4" w:space="0" w:color="DADCE0"/>
+              <w:end w:val="single" w:sz="4" w:space="0" w:color="DADCE0"/>
+              <w:insideH w:val="single" w:sz="4" w:space="0" w:color="DADCE0"/>
+              <w:insideV w:val="single" w:sz="4" w:space="0" w:color="DADCE0"/>
+            </w:tcBorders>
+            <w:tcMar>
+              <w:top w:w="80" w:type="dxa"/>
+              <w:start w:w="120" w:type="dxa"/>
+              <w:bottom w:w="80" w:type="dxa"/>
+              <w:end w:w="120" w:type="dxa"/>
+            </w:tcMar>
+            <w:vAlign w:val="center"/>
+          </w:tcPr>
+          <w:p>
+            <w:pPr>
+              <w:spacing w:after="0"/>
+            </w:pPr>
+            <w:r>
+              <w:rPr>
+                <w:rFonts w:ascii="Arial" w:hAnsi="Arial"/>
+                <w:b w:val="0"/>
+                <w:color w:val="000000"/>
+                <w:sz w:val="20"/>
+              </w:rPr>
+              <w:t>Reject, revise, resume</w:t>
+            </w:r>
+          </w:p>
+        </w:tc>
+        <w:tc>
+          <w:tcPr>
+            <w:tcW w:type="dxa" w:w="4960"/>
+            <w:tcBorders>
+              <w:top w:val="single" w:sz="4" w:space="0" w:color="DADCE0"/>
+              <w:start w:val="single" w:sz="4" w:space="0" w:color="DADCE0"/>
+              <w:bottom w:val="single" w:sz="4" w:space="0" w:color="DADCE0"/>
+              <w:end w:val="single" w:sz="4" w:space="0" w:color="DADCE0"/>
+              <w:insideH w:val="single" w:sz="4" w:space="0" w:color="DADCE0"/>
+              <w:insideV w:val="single" w:sz="4" w:space="0" w:color="DADCE0"/>
+            </w:tcBorders>
+            <w:tcMar>
+              <w:top w:w="80" w:type="dxa"/>
+              <w:start w:w="120" w:type="dxa"/>
+              <w:bottom w:w="80" w:type="dxa"/>
+              <w:end w:w="120" w:type="dxa"/>
+            </w:tcMar>
+            <w:vAlign w:val="center"/>
+          </w:tcPr>
+          <w:p>
+            <w:pPr>
+              <w:spacing w:after="0"/>
+            </w:pPr>
+            <w:r>
+              <w:rPr>
+                <w:rFonts w:ascii="Arial" w:hAnsi="Arial"/>
+                <w:b w:val="0"/>
+                <w:color w:val="000000"/>
+                <w:sz w:val="20"/>
+              </w:rPr>
+              <w:t>Completed on the same run ID</w:t>
+            </w:r>
+          </w:p>
+        </w:tc>
+      </w:tr>
+      <w:tr>
+        <w:tc>
+          <w:tcPr>
+            <w:tcW w:type="dxa" w:w="4400"/>
+            <w:tcBorders>
+              <w:top w:val="single" w:sz="4" w:space="0" w:color="DADCE0"/>
+              <w:start w:val="single" w:sz="4" w:space="0" w:color="DADCE0"/>
+              <w:bottom w:val="single" w:sz="4" w:space="0" w:color="DADCE0"/>
+              <w:end w:val="single" w:sz="4" w:space="0" w:color="DADCE0"/>
+              <w:insideH w:val="single" w:sz="4" w:space="0" w:color="DADCE0"/>
+              <w:insideV w:val="single" w:sz="4" w:space="0" w:color="DADCE0"/>
+            </w:tcBorders>
+            <w:tcMar>
+              <w:top w:w="80" w:type="dxa"/>
+              <w:start w:w="120" w:type="dxa"/>
+              <w:bottom w:w="80" w:type="dxa"/>
+              <w:end w:w="120" w:type="dxa"/>
+            </w:tcMar>
+            <w:vAlign w:val="center"/>
+          </w:tcPr>
+          <w:p>
+            <w:pPr>
+              <w:spacing w:after="0"/>
+            </w:pPr>
+            <w:r>
+              <w:rPr>
+                <w:rFonts w:ascii="Arial" w:hAnsi="Arial"/>
+                <w:b w:val="0"/>
+                <w:color w:val="000000"/>
+                <w:sz w:val="20"/>
+              </w:rPr>
               <w:t>Invented missing values</w:t>
             </w:r>
           </w:p>
@@ -2724,7 +3039,7 @@
           <w:color w:val="000000"/>
           <w:sz w:val="22"/>
         </w:rPr>
-        <w:t>The Week 2 feedback was architectural, not cosmetic. A complete submission must include every frontend and backend source needed to trace the documented request flow.</w:t>
+        <w:t>A reproducible submission must place every frontend, backend, graph, and test source directly in the repository tree.</w:t>
       </w:r>
     </w:p>
     <w:p>
@@ -2814,18 +3129,7 @@
           <w:color w:val="000000"/>
           <w:sz w:val="22"/>
         </w:rPr>
-        <w:t>Replit setup: import the GitHub repository, add OPENAI_API_KEY under Secrets, click Run, and use Run the winning demo for the deterministic presentation path.</w:t>
-      </w:r>
-    </w:p>
-    <w:p>
-      <w:r>
-        <w:rPr>
-          <w:rFonts w:ascii="Arial" w:hAnsi="Arial"/>
-          <w:b w:val="0"/>
-          <w:color w:val="000000"/>
-          <w:sz w:val="22"/>
-        </w:rPr>
-        <w:t>GitHub repository: [ADD PUBLIC GITHUB URL]</w:t>
+        <w:t>Replit setup: import the GitHub repository, add OPENAI_API_KEY under Secrets for image and scanned-PDF analysis, click Run, and choose any deterministic demo.</w:t>
       </w:r>
     </w:p>
     <w:p>
@@ -2840,37 +3144,12 @@
       </w:r>
     </w:p>
     <w:p>
-      <w:r>
-        <w:rPr>
-          <w:rFonts w:ascii="Arial" w:hAnsi="Arial"/>
-          <w:b w:val="0"/>
-          <w:color w:val="000000"/>
-          <w:sz w:val="22"/>
-        </w:rPr>
-        <w:t>Demo recording (5 minutes or less): [ADD VIDEO URL]</w:t>
-      </w:r>
-    </w:p>
-    <w:p>
       <w:pPr>
         <w:pStyle w:val="Heading1"/>
         <w:keepNext/>
       </w:pPr>
       <w:r>
         <w:t>Final submission checklist</w:t>
-      </w:r>
-    </w:p>
-    <w:p>
-      <w:pPr>
-        <w:pStyle w:val="ListBullet"/>
-      </w:pPr>
-      <w:r>
-        <w:rPr>
-          <w:rFonts w:ascii="Arial" w:hAnsi="Arial"/>
-          <w:b w:val="0"/>
-          <w:color w:val="000000"/>
-          <w:sz w:val="22"/>
-        </w:rPr>
-        <w:t>Replace [Your Name] and all [ADD URL] placeholders.</w:t>
       </w:r>
     </w:p>
     <w:p>
@@ -2940,7 +3219,7 @@
           <w:color w:val="000000"/>
           <w:sz w:val="22"/>
         </w:rPr>
-        <w:t>Submit the Google Doc, video, and GitHub links before Sunday, August 30, 2026.</w:t>
+        <w:t>Open the repository, application, document, and video links in a signed-out browser before submission.</w:t>
       </w:r>
     </w:p>
     <w:sectPr>
@@ -3667,6 +3946,9 @@
     <w:qFormat/>
     <w:rsid w:val="00FC693F"/>
     <w:pPr>
+      <w:pBdr>
+        <w:bottom w:val="single" w:sz="8" w:space="4" w:color="4F81BD" w:themeColor="accent1"/>
+      </w:pBdr>
       <w:spacing w:after="300" w:line="240" w:lineRule="auto"/>
       <w:contextualSpacing/>
     </w:pPr>

</xml_diff>